<commit_message>
docs: :memo: testing repord fixed
</commit_message>
<xml_diff>
--- a/reports/Student #1/Testing Report.docx
+++ b/reports/Student #1/Testing Report.docx
@@ -603,7 +603,7 @@
                 <w:noProof/>
                 <w:webHidden/>
               </w:rPr>
-              <w:t>4</w:t>
+              <w:t>3</w:t>
             </w:r>
             <w:r>
               <w:rPr>
@@ -1699,7 +1699,7 @@
                 <w:noProof/>
                 <w:webHidden/>
               </w:rPr>
-              <w:t>14</w:t>
+              <w:t>15</w:t>
             </w:r>
             <w:r>
               <w:rPr>
@@ -1772,7 +1772,7 @@
                 <w:noProof/>
                 <w:webHidden/>
               </w:rPr>
-              <w:t>14</w:t>
+              <w:t>15</w:t>
             </w:r>
             <w:r>
               <w:rPr>
@@ -2295,7 +2295,15 @@
           <w:sz w:val="28"/>
           <w:szCs w:val="24"/>
         </w:rPr>
-        <w:t>, correspondiendo a los archivos “.</w:t>
+        <w:t xml:space="preserve">, correspondiendo a los archivos </w:t>
+      </w:r>
+      <w:proofErr w:type="gramStart"/>
+      <w:r>
+        <w:rPr>
+          <w:sz w:val="28"/>
+          <w:szCs w:val="24"/>
+        </w:rPr>
+        <w:t>“.</w:t>
       </w:r>
       <w:proofErr w:type="spellStart"/>
       <w:r>
@@ -2306,12 +2314,21 @@
         <w:t>safe</w:t>
       </w:r>
       <w:proofErr w:type="spellEnd"/>
-      <w:r>
-        <w:rPr>
-          <w:sz w:val="28"/>
-          <w:szCs w:val="24"/>
-        </w:rPr>
-        <w:t>” y “.</w:t>
+      <w:proofErr w:type="gramEnd"/>
+      <w:r>
+        <w:rPr>
+          <w:sz w:val="28"/>
+          <w:szCs w:val="24"/>
+        </w:rPr>
+        <w:t xml:space="preserve">” y </w:t>
+      </w:r>
+      <w:proofErr w:type="gramStart"/>
+      <w:r>
+        <w:rPr>
+          <w:sz w:val="28"/>
+          <w:szCs w:val="24"/>
+        </w:rPr>
+        <w:t>“.</w:t>
       </w:r>
       <w:proofErr w:type="spellStart"/>
       <w:r>
@@ -2322,6 +2339,7 @@
         <w:t>hack</w:t>
       </w:r>
       <w:proofErr w:type="spellEnd"/>
+      <w:proofErr w:type="gramEnd"/>
       <w:r>
         <w:rPr>
           <w:sz w:val="28"/>
@@ -2631,6 +2649,7 @@
         <w:t xml:space="preserve">Se ha accedido haciendo </w:t>
       </w:r>
       <w:proofErr w:type="spellStart"/>
+      <w:proofErr w:type="gramStart"/>
       <w:r>
         <w:rPr>
           <w:sz w:val="28"/>
@@ -2639,6 +2658,7 @@
         <w:t>click</w:t>
       </w:r>
       <w:proofErr w:type="spellEnd"/>
+      <w:proofErr w:type="gramEnd"/>
       <w:r>
         <w:rPr>
           <w:sz w:val="28"/>
@@ -4243,6 +4263,7 @@
         <w:t xml:space="preserve">Se ha accedido haciendo </w:t>
       </w:r>
       <w:proofErr w:type="spellStart"/>
+      <w:proofErr w:type="gramStart"/>
       <w:r>
         <w:rPr>
           <w:sz w:val="28"/>
@@ -4251,6 +4272,7 @@
         <w:t>click</w:t>
       </w:r>
       <w:proofErr w:type="spellEnd"/>
+      <w:proofErr w:type="gramEnd"/>
       <w:r>
         <w:rPr>
           <w:sz w:val="28"/>
@@ -4517,7 +4539,23 @@
           <w:sz w:val="28"/>
           <w:szCs w:val="24"/>
         </w:rPr>
-        <w:t xml:space="preserve"> del mostrado el “show” por “</w:t>
+        <w:t xml:space="preserve"> del mostrado el “</w:t>
+      </w:r>
+      <w:proofErr w:type="gramStart"/>
+      <w:r>
+        <w:rPr>
+          <w:sz w:val="28"/>
+          <w:szCs w:val="24"/>
+        </w:rPr>
+        <w:t>show</w:t>
+      </w:r>
+      <w:proofErr w:type="gramEnd"/>
+      <w:r>
+        <w:rPr>
+          <w:sz w:val="28"/>
+          <w:szCs w:val="24"/>
+        </w:rPr>
+        <w:t>” por “</w:t>
       </w:r>
       <w:proofErr w:type="spellStart"/>
       <w:r>

</xml_diff>